<commit_message>
Quelques modifications au fichier Word
</commit_message>
<xml_diff>
--- a/énoncé_APP4.docx
+++ b/énoncé_APP4.docx
@@ -876,7 +876,23 @@
           <w:rFonts w:ascii="Calibri" w:hAnsi="Calibri" w:cs="Calibri"/>
           <w:highlight w:val="yellow"/>
         </w:rPr>
-        <w:t>Je n’exigerai pas de tests ou de javadoc pour ce travail,</w:t>
+        <w:t xml:space="preserve">Je n’exigerai pas de tests ou de </w:t>
+      </w:r>
+      <w:proofErr w:type="spellStart"/>
+      <w:r>
+        <w:rPr>
+          <w:rFonts w:ascii="Calibri" w:hAnsi="Calibri" w:cs="Calibri"/>
+          <w:highlight w:val="yellow"/>
+        </w:rPr>
+        <w:t>javadoc</w:t>
+      </w:r>
+      <w:proofErr w:type="spellEnd"/>
+      <w:r>
+        <w:rPr>
+          <w:rFonts w:ascii="Calibri" w:hAnsi="Calibri" w:cs="Calibri"/>
+          <w:highlight w:val="yellow"/>
+        </w:rPr>
+        <w:t xml:space="preserve"> pour ce travail,</w:t>
       </w:r>
       <w:r>
         <w:rPr>
@@ -1039,7 +1055,23 @@
         <w:jc w:val="both"/>
       </w:pPr>
       <w:r>
-        <w:t>Vous travaillez au sein du département de R&amp;D d'une firme spécialisée en infrastructures énergétiques intelligentes. L'entreprise conçoit des micro-réseaux (micro-grids) capables de s'auto-organiser pour distribuer l'électricité de manière optimale entre des sources renouvelables et des clusters de consommation.</w:t>
+        <w:t>Vous travaillez au sein du département de R&amp;D d'une firme spécialisée en infrastructures énergétiques intelligentes. L'entreprise conçoit des micro-réseaux (micro-</w:t>
+      </w:r>
+      <w:proofErr w:type="spellStart"/>
+      <w:r>
+        <w:t>grids</w:t>
+      </w:r>
+      <w:proofErr w:type="spellEnd"/>
+      <w:r>
+        <w:t>) capables de s'</w:t>
+      </w:r>
+      <w:proofErr w:type="spellStart"/>
+      <w:r>
+        <w:t>auto-organiser</w:t>
+      </w:r>
+      <w:proofErr w:type="spellEnd"/>
+      <w:r>
+        <w:t xml:space="preserve"> pour distribuer l'électricité de manière optimale entre des sources renouvelables et des clusters de consommation.</w:t>
       </w:r>
     </w:p>
     <w:p>
@@ -1125,7 +1157,15 @@
         <w:t xml:space="preserve"> </w:t>
       </w:r>
       <w:r>
-        <w:t>Cette structure "en poupées russes" rend impossible l'utilisation d'une boucle simple (for ou while), car le nombre d'imbrications est inconnu au moment de la compilation.</w:t>
+        <w:t xml:space="preserve">Cette structure "en poupées russes" rend impossible l'utilisation d'une boucle simple (for ou </w:t>
+      </w:r>
+      <w:proofErr w:type="spellStart"/>
+      <w:r>
+        <w:t>while</w:t>
+      </w:r>
+      <w:proofErr w:type="spellEnd"/>
+      <w:r>
+        <w:t>), car le nombre d'imbrications est inconnu au moment de la compilation.</w:t>
       </w:r>
       <w:r>
         <w:t xml:space="preserve"> </w:t>
@@ -1381,8 +1421,16 @@
         <w:rPr>
           <w:lang w:val="fr-CA"/>
         </w:rPr>
-        <w:t>fichiers json</w:t>
-      </w:r>
+        <w:t xml:space="preserve">fichiers </w:t>
+      </w:r>
+      <w:proofErr w:type="spellStart"/>
+      <w:r>
+        <w:rPr>
+          <w:lang w:val="fr-CA"/>
+        </w:rPr>
+        <w:t>json</w:t>
+      </w:r>
+      <w:proofErr w:type="spellEnd"/>
       <w:r>
         <w:rPr>
           <w:lang w:val="fr-CA"/>
@@ -1401,7 +1449,29 @@
         <w:rPr>
           <w:lang w:val="fr-CA"/>
         </w:rPr>
-        <w:t xml:space="preserve"> (ex: [1] circuit_nord.json).</w:t>
+        <w:t xml:space="preserve"> (ex: [1] </w:t>
+      </w:r>
+      <w:proofErr w:type="spellStart"/>
+      <w:r>
+        <w:rPr>
+          <w:lang w:val="fr-CA"/>
+        </w:rPr>
+        <w:t>circuit_</w:t>
+      </w:r>
+      <w:proofErr w:type="gramStart"/>
+      <w:r>
+        <w:rPr>
+          <w:lang w:val="fr-CA"/>
+        </w:rPr>
+        <w:t>nord.json</w:t>
+      </w:r>
+      <w:proofErr w:type="spellEnd"/>
+      <w:proofErr w:type="gramEnd"/>
+      <w:r>
+        <w:rPr>
+          <w:lang w:val="fr-CA"/>
+        </w:rPr>
+        <w:t>).</w:t>
       </w:r>
     </w:p>
     <w:p>
@@ -1636,7 +1706,21 @@
         <w:rPr>
           <w:lang w:val="fr-CA"/>
         </w:rPr>
-        <w:t xml:space="preserve"> (les System.out.println).</w:t>
+        <w:t xml:space="preserve"> (les </w:t>
+      </w:r>
+      <w:proofErr w:type="spellStart"/>
+      <w:r>
+        <w:rPr>
+          <w:lang w:val="fr-CA"/>
+        </w:rPr>
+        <w:t>System.out.println</w:t>
+      </w:r>
+      <w:proofErr w:type="spellEnd"/>
+      <w:r>
+        <w:rPr>
+          <w:lang w:val="fr-CA"/>
+        </w:rPr>
+        <w:t>).</w:t>
       </w:r>
     </w:p>
     <w:p>
@@ -2128,19 +2212,43 @@
         </w:drawing>
       </w:r>
       <w:r>
-        <w:t xml:space="preserve">Trois circuits vous sont fournis pour effectuer le travail. Ceux-ci ainsi que leur représentation json vous sont fournis dans le </w:t>
+        <w:t xml:space="preserve">Trois circuits vous sont fournis pour effectuer le travail. Ceux-ci ainsi que leur représentation </w:t>
+      </w:r>
+      <w:proofErr w:type="spellStart"/>
+      <w:r>
+        <w:t>json</w:t>
+      </w:r>
+      <w:proofErr w:type="spellEnd"/>
+      <w:r>
+        <w:t xml:space="preserve"> vous sont fournis dans le </w:t>
       </w:r>
       <w:r>
         <w:t>dossier</w:t>
       </w:r>
       <w:r>
-        <w:t xml:space="preserve"> « donnees »</w:t>
+        <w:t xml:space="preserve"> « </w:t>
+      </w:r>
+      <w:proofErr w:type="spellStart"/>
+      <w:r>
+        <w:t>donnees</w:t>
+      </w:r>
+      <w:proofErr w:type="spellEnd"/>
+      <w:r>
+        <w:t> »</w:t>
       </w:r>
       <w:r>
         <w:t xml:space="preserve"> fourni avec cet énoncé</w:t>
       </w:r>
       <w:r>
-        <w:t>. Prenez le temps de bien observer les circuits et la structure des json avant de commencer.</w:t>
+        <w:t xml:space="preserve">. Prenez le temps de bien observer les circuits et la structure des </w:t>
+      </w:r>
+      <w:proofErr w:type="spellStart"/>
+      <w:r>
+        <w:t>json</w:t>
+      </w:r>
+      <w:proofErr w:type="spellEnd"/>
+      <w:r>
+        <w:t xml:space="preserve"> avant de commencer.</w:t>
       </w:r>
     </w:p>
     <w:p>
@@ -2969,7 +3077,32 @@
           <w:rFonts w:ascii="Calibri" w:hAnsi="Calibri" w:cs="Calibri"/>
           <w:color w:val="000000"/>
         </w:rPr>
-        <w:t>On voit que la méthode calculerResistance() se répète dans plusieurs classes. Pourquoi ?</w:t>
+        <w:t xml:space="preserve">On voit que la méthode </w:t>
+      </w:r>
+      <w:proofErr w:type="spellStart"/>
+      <w:proofErr w:type="gramStart"/>
+      <w:r>
+        <w:rPr>
+          <w:rFonts w:ascii="Calibri" w:hAnsi="Calibri" w:cs="Calibri"/>
+          <w:color w:val="000000"/>
+        </w:rPr>
+        <w:t>calculerResistance</w:t>
+      </w:r>
+      <w:proofErr w:type="spellEnd"/>
+      <w:r>
+        <w:rPr>
+          <w:rFonts w:ascii="Calibri" w:hAnsi="Calibri" w:cs="Calibri"/>
+          <w:color w:val="000000"/>
+        </w:rPr>
+        <w:t>(</w:t>
+      </w:r>
+      <w:proofErr w:type="gramEnd"/>
+      <w:r>
+        <w:rPr>
+          <w:rFonts w:ascii="Calibri" w:hAnsi="Calibri" w:cs="Calibri"/>
+          <w:color w:val="000000"/>
+        </w:rPr>
+        <w:t>) se répète dans plusieurs classes. Pourquoi ?</w:t>
       </w:r>
     </w:p>
     <w:tbl>
@@ -3009,7 +3142,29 @@
               <w:rPr>
                 <w:rFonts w:ascii="Calibri" w:hAnsi="Calibri" w:cs="Calibri"/>
               </w:rPr>
-              <w:t>Ces classes ont tous des implémentations différentes de la méthode abstraite calculerResistance() pour permettre de mieux représenter les différentes manières de calculer la résistance d’une composante (qui est la classe qui définit cette méthode) : une résistance a une résistance constante, un circuit en série à une résistance avec une certaine formule et un circuit en parallèle a une autre formule.</w:t>
+              <w:t xml:space="preserve">Ces classes ont tous des implémentations différentes de la méthode abstraite </w:t>
+            </w:r>
+            <w:proofErr w:type="spellStart"/>
+            <w:proofErr w:type="gramStart"/>
+            <w:r>
+              <w:rPr>
+                <w:rFonts w:ascii="Calibri" w:hAnsi="Calibri" w:cs="Calibri"/>
+              </w:rPr>
+              <w:t>calculerResistance</w:t>
+            </w:r>
+            <w:proofErr w:type="spellEnd"/>
+            <w:r>
+              <w:rPr>
+                <w:rFonts w:ascii="Calibri" w:hAnsi="Calibri" w:cs="Calibri"/>
+              </w:rPr>
+              <w:t>(</w:t>
+            </w:r>
+            <w:proofErr w:type="gramEnd"/>
+            <w:r>
+              <w:rPr>
+                <w:rFonts w:ascii="Calibri" w:hAnsi="Calibri" w:cs="Calibri"/>
+              </w:rPr>
+              <w:t>) pour permettre de mieux représenter les différentes manières de calculer la résistance d’une composante (qui est la classe qui définit cette méthode) : une résistance a une résistance constante, un circuit en série à une résistance avec une certaine formule et un circuit en parallèle a une autre formule.</w:t>
             </w:r>
           </w:p>
           <w:p>
@@ -3488,6 +3643,88 @@
                 <w:lang w:eastAsia="ja-JP"/>
               </w:rPr>
             </w:pPr>
+            <w:r>
+              <w:rPr>
+                <w:rFonts w:ascii="Calibri" w:eastAsiaTheme="minorEastAsia" w:hAnsi="Calibri" w:cs="Calibri"/>
+                <w:lang w:eastAsia="ja-JP"/>
+              </w:rPr>
+              <w:t xml:space="preserve">Le cas de base serait lorsqu’une résistance est trouvée, car sa méthode </w:t>
+            </w:r>
+            <w:proofErr w:type="spellStart"/>
+            <w:proofErr w:type="gramStart"/>
+            <w:r>
+              <w:rPr>
+                <w:rFonts w:ascii="Calibri" w:eastAsiaTheme="minorEastAsia" w:hAnsi="Calibri" w:cs="Calibri"/>
+                <w:lang w:eastAsia="ja-JP"/>
+              </w:rPr>
+              <w:t>calculerResistance</w:t>
+            </w:r>
+            <w:proofErr w:type="spellEnd"/>
+            <w:r>
+              <w:rPr>
+                <w:rFonts w:ascii="Calibri" w:eastAsiaTheme="minorEastAsia" w:hAnsi="Calibri" w:cs="Calibri"/>
+                <w:lang w:eastAsia="ja-JP"/>
+              </w:rPr>
+              <w:t>(</w:t>
+            </w:r>
+            <w:proofErr w:type="gramEnd"/>
+            <w:r>
+              <w:rPr>
+                <w:rFonts w:ascii="Calibri" w:eastAsiaTheme="minorEastAsia" w:hAnsi="Calibri" w:cs="Calibri"/>
+                <w:lang w:eastAsia="ja-JP"/>
+              </w:rPr>
+              <w:t xml:space="preserve">) ne retourne qu’un double stocké en attribut; elle n’appelle pas </w:t>
+            </w:r>
+            <w:proofErr w:type="spellStart"/>
+            <w:proofErr w:type="gramStart"/>
+            <w:r>
+              <w:rPr>
+                <w:rFonts w:ascii="Calibri" w:eastAsiaTheme="minorEastAsia" w:hAnsi="Calibri" w:cs="Calibri"/>
+                <w:lang w:eastAsia="ja-JP"/>
+              </w:rPr>
+              <w:t>calculerResistance</w:t>
+            </w:r>
+            <w:proofErr w:type="spellEnd"/>
+            <w:r>
+              <w:rPr>
+                <w:rFonts w:ascii="Calibri" w:eastAsiaTheme="minorEastAsia" w:hAnsi="Calibri" w:cs="Calibri"/>
+                <w:lang w:eastAsia="ja-JP"/>
+              </w:rPr>
+              <w:t>(</w:t>
+            </w:r>
+            <w:proofErr w:type="gramEnd"/>
+            <w:r>
+              <w:rPr>
+                <w:rFonts w:ascii="Calibri" w:eastAsiaTheme="minorEastAsia" w:hAnsi="Calibri" w:cs="Calibri"/>
+                <w:lang w:eastAsia="ja-JP"/>
+              </w:rPr>
+              <w:t xml:space="preserve">) pour d’autres composantes. Les méthodes pour les circuits en série et en parallèle appellent </w:t>
+            </w:r>
+            <w:proofErr w:type="spellStart"/>
+            <w:proofErr w:type="gramStart"/>
+            <w:r>
+              <w:rPr>
+                <w:rFonts w:ascii="Calibri" w:eastAsiaTheme="minorEastAsia" w:hAnsi="Calibri" w:cs="Calibri"/>
+                <w:lang w:eastAsia="ja-JP"/>
+              </w:rPr>
+              <w:t>calculerResistance</w:t>
+            </w:r>
+            <w:proofErr w:type="spellEnd"/>
+            <w:r>
+              <w:rPr>
+                <w:rFonts w:ascii="Calibri" w:eastAsiaTheme="minorEastAsia" w:hAnsi="Calibri" w:cs="Calibri"/>
+                <w:lang w:eastAsia="ja-JP"/>
+              </w:rPr>
+              <w:t>(</w:t>
+            </w:r>
+            <w:proofErr w:type="gramEnd"/>
+            <w:r>
+              <w:rPr>
+                <w:rFonts w:ascii="Calibri" w:eastAsiaTheme="minorEastAsia" w:hAnsi="Calibri" w:cs="Calibri"/>
+                <w:lang w:eastAsia="ja-JP"/>
+              </w:rPr>
+              <w:t>) pour leurs composants, donc ils ne s’agissent pas de cas de base, sauf si on traite un circuit vide (avec 0 composants.)</w:t>
+            </w:r>
           </w:p>
           <w:p>
             <w:pPr>
@@ -3829,6 +4066,7 @@
                 <w:rFonts w:ascii="Calibri" w:eastAsiaTheme="minorEastAsia" w:hAnsi="Calibri" w:cs="Calibri"/>
                 <w:lang w:eastAsia="ja-JP"/>
               </w:rPr>
+              <w:lastRenderedPageBreak/>
               <w:t>Au deuxième niveau, des circuits en série sont trouvés. Dedans sont trouvés des composantes : la méthode est rappelée pour chaque composante. Après les résistances et le circuit en série forme un objet.</w:t>
             </w:r>
           </w:p>
@@ -4636,7 +4874,27 @@
           <w:sz w:val="24"/>
           <w:szCs w:val="24"/>
         </w:rPr>
-        <w:t xml:space="preserve">C’est le temps de faire vos recherches, consulter des ressources et </w:t>
+        <w:t xml:space="preserve">C’est le temps </w:t>
+      </w:r>
+      <w:proofErr w:type="gramStart"/>
+      <w:r>
+        <w:rPr>
+          <w:rFonts w:ascii="Calibri" w:hAnsi="Calibri" w:cs="Calibri"/>
+          <w:color w:val="000000"/>
+          <w:sz w:val="24"/>
+          <w:szCs w:val="24"/>
+        </w:rPr>
+        <w:t>de faire</w:t>
+      </w:r>
+      <w:proofErr w:type="gramEnd"/>
+      <w:r>
+        <w:rPr>
+          <w:rFonts w:ascii="Calibri" w:hAnsi="Calibri" w:cs="Calibri"/>
+          <w:color w:val="000000"/>
+          <w:sz w:val="24"/>
+          <w:szCs w:val="24"/>
+        </w:rPr>
+        <w:t xml:space="preserve"> vos recherches, consulter des ressources et </w:t>
       </w:r>
       <w:r>
         <w:rPr>
@@ -4812,6 +5070,7 @@
         <w:rPr>
           <w:rFonts w:ascii="Calibri" w:hAnsi="Calibri" w:cs="Calibri"/>
         </w:rPr>
+        <w:lastRenderedPageBreak/>
         <w:t xml:space="preserve">Discutez et </w:t>
       </w:r>
       <w:r>
@@ -4994,7 +5253,6 @@
           <w:rFonts w:ascii="Calibri" w:hAnsi="Calibri" w:cs="Calibri"/>
           <w:bCs/>
         </w:rPr>
-        <w:lastRenderedPageBreak/>
         <w:t>Ne vous partager pas trop de code spécifique, mais vous pouvez utiliser vos diagrammes de classe</w:t>
       </w:r>
       <w:r>
@@ -7187,8 +7445,18 @@
                 <w:sz w:val="18"/>
                 <w:szCs w:val="18"/>
               </w:rPr>
-              <w:t>Utilisation rigoureuse d’un gestionnaire de version             (</w:t>
-            </w:r>
+              <w:t xml:space="preserve">Utilisation rigoureuse d’un gestionnaire de version          </w:t>
+            </w:r>
+            <w:proofErr w:type="gramStart"/>
+            <w:r>
+              <w:rPr>
+                <w:rFonts w:ascii="Calibri" w:hAnsi="Calibri" w:cs="Calibri"/>
+                <w:sz w:val="18"/>
+                <w:szCs w:val="18"/>
+              </w:rPr>
+              <w:t xml:space="preserve">   (</w:t>
+            </w:r>
+            <w:proofErr w:type="gramEnd"/>
             <w:r>
               <w:rPr>
                 <w:rFonts w:ascii="Calibri" w:hAnsi="Calibri" w:cs="Calibri"/>
@@ -7444,7 +7712,25 @@
                 <w:sz w:val="18"/>
                 <w:szCs w:val="18"/>
               </w:rPr>
-              <w:t xml:space="preserve"> (commits présents, </w:t>
+              <w:t xml:space="preserve"> (</w:t>
+            </w:r>
+            <w:proofErr w:type="spellStart"/>
+            <w:r>
+              <w:rPr>
+                <w:rFonts w:ascii="Calibri" w:hAnsi="Calibri" w:cs="Calibri"/>
+                <w:sz w:val="18"/>
+                <w:szCs w:val="18"/>
+              </w:rPr>
+              <w:t>commits</w:t>
+            </w:r>
+            <w:proofErr w:type="spellEnd"/>
+            <w:r>
+              <w:rPr>
+                <w:rFonts w:ascii="Calibri" w:hAnsi="Calibri" w:cs="Calibri"/>
+                <w:sz w:val="18"/>
+                <w:szCs w:val="18"/>
+              </w:rPr>
+              <w:t xml:space="preserve"> présents, </w:t>
             </w:r>
             <w:r>
               <w:rPr>
@@ -7544,7 +7830,25 @@
                 <w:sz w:val="18"/>
                 <w:szCs w:val="18"/>
               </w:rPr>
-              <w:t>(commits réguliers</w:t>
+              <w:t>(</w:t>
+            </w:r>
+            <w:proofErr w:type="spellStart"/>
+            <w:r>
+              <w:rPr>
+                <w:rFonts w:ascii="Calibri" w:hAnsi="Calibri" w:cs="Calibri"/>
+                <w:sz w:val="18"/>
+                <w:szCs w:val="18"/>
+              </w:rPr>
+              <w:t>commits</w:t>
+            </w:r>
+            <w:proofErr w:type="spellEnd"/>
+            <w:r>
+              <w:rPr>
+                <w:rFonts w:ascii="Calibri" w:hAnsi="Calibri" w:cs="Calibri"/>
+                <w:sz w:val="18"/>
+                <w:szCs w:val="18"/>
+              </w:rPr>
+              <w:t xml:space="preserve"> réguliers</w:t>
             </w:r>
             <w:r>
               <w:rPr>
@@ -7630,13 +7934,23 @@
               </w:rPr>
               <w:t>Utilisation maîtrisée et rigoureuse (</w:t>
             </w:r>
-            <w:r>
-              <w:rPr>
-                <w:rFonts w:ascii="Calibri" w:hAnsi="Calibri" w:cs="Calibri"/>
-                <w:sz w:val="18"/>
-                <w:szCs w:val="18"/>
-              </w:rPr>
-              <w:t xml:space="preserve">commits systématiques, </w:t>
+            <w:proofErr w:type="spellStart"/>
+            <w:r>
+              <w:rPr>
+                <w:rFonts w:ascii="Calibri" w:hAnsi="Calibri" w:cs="Calibri"/>
+                <w:sz w:val="18"/>
+                <w:szCs w:val="18"/>
+              </w:rPr>
+              <w:t>commits</w:t>
+            </w:r>
+            <w:proofErr w:type="spellEnd"/>
+            <w:r>
+              <w:rPr>
+                <w:rFonts w:ascii="Calibri" w:hAnsi="Calibri" w:cs="Calibri"/>
+                <w:sz w:val="18"/>
+                <w:szCs w:val="18"/>
+              </w:rPr>
+              <w:t xml:space="preserve"> systématiques, </w:t>
             </w:r>
             <w:r>
               <w:rPr>

</xml_diff>